<commit_message>
Hoàn thành Phần 1: Các lệnh thao tác cơ bản với Docker Buổi 4
</commit_message>
<xml_diff>
--- a/Week04/Part1_DockerBase/DockerBase.docx
+++ b/Week04/Part1_DockerBase/DockerBase.docx
@@ -1,6 +1,6 @@
 
 <file path=word/document.xml><?xml version="1.0" encoding="utf-8"?>
-<w:document xmlns:wpc="http://schemas.microsoft.com/office/word/2010/wordprocessingCanvas" xmlns:mc="http://schemas.openxmlformats.org/markup-compatibility/2006" xmlns:o="urn:schemas-microsoft-com:office:office" xmlns:r="http://schemas.openxmlformats.org/officeDocument/2006/relationships" xmlns:m="http://schemas.openxmlformats.org/officeDocument/2006/math" xmlns:v="urn:schemas-microsoft-com:vml" xmlns:wp14="http://schemas.microsoft.com/office/word/2010/wordprocessingDrawing" xmlns:wp="http://schemas.openxmlformats.org/drawingml/2006/wordprocessingDrawing" xmlns:w10="urn:schemas-microsoft-com:office:word" xmlns:w="http://schemas.openxmlformats.org/wordprocessingml/2006/main" xmlns:w14="http://schemas.microsoft.com/office/word/2010/wordml" xmlns:w15="http://schemas.microsoft.com/office/word/2012/wordml" xmlns:wpg="http://schemas.microsoft.com/office/word/2010/wordprocessingGroup" xmlns:wpi="http://schemas.microsoft.com/office/word/2010/wordprocessingInk" xmlns:wne="http://schemas.microsoft.com/office/word/2006/wordml" xmlns:wps="http://schemas.microsoft.com/office/word/2010/wordprocessingShape" mc:Ignorable="w14 w15 wp14">
+<w:document xmlns:wpc="http://schemas.microsoft.com/office/word/2010/wordprocessingCanvas" xmlns:cx="http://schemas.microsoft.com/office/drawing/2014/chartex" xmlns:cx1="http://schemas.microsoft.com/office/drawing/2015/9/8/chartex" xmlns:cx2="http://schemas.microsoft.com/office/drawing/2015/10/21/chartex" xmlns:cx3="http://schemas.microsoft.com/office/drawing/2016/5/9/chartex" xmlns:cx4="http://schemas.microsoft.com/office/drawing/2016/5/10/chartex" xmlns:cx5="http://schemas.microsoft.com/office/drawing/2016/5/11/chartex" xmlns:cx6="http://schemas.microsoft.com/office/drawing/2016/5/12/chartex" xmlns:cx7="http://schemas.microsoft.com/office/drawing/2016/5/13/chartex" xmlns:cx8="http://schemas.microsoft.com/office/drawing/2016/5/14/chartex" xmlns:mc="http://schemas.openxmlformats.org/markup-compatibility/2006" xmlns:aink="http://schemas.microsoft.com/office/drawing/2016/ink" xmlns:am3d="http://schemas.microsoft.com/office/drawing/2017/model3d" xmlns:o="urn:schemas-microsoft-com:office:office" xmlns:oel="http://schemas.microsoft.com/office/2019/extlst" xmlns:r="http://schemas.openxmlformats.org/officeDocument/2006/relationships" xmlns:m="http://schemas.openxmlformats.org/officeDocument/2006/math" xmlns:v="urn:schemas-microsoft-com:vml" xmlns:wp14="http://schemas.microsoft.com/office/word/2010/wordprocessingDrawing" xmlns:wp="http://schemas.openxmlformats.org/drawingml/2006/wordprocessingDrawing" xmlns:w10="urn:schemas-microsoft-com:office:word" xmlns:w="http://schemas.openxmlformats.org/wordprocessingml/2006/main" xmlns:w14="http://schemas.microsoft.com/office/word/2010/wordml" xmlns:w15="http://schemas.microsoft.com/office/word/2012/wordml" xmlns:w16cex="http://schemas.microsoft.com/office/word/2018/wordml/cex" xmlns:w16cid="http://schemas.microsoft.com/office/word/2016/wordml/cid" xmlns:w16="http://schemas.microsoft.com/office/word/2018/wordml" xmlns:w16du="http://schemas.microsoft.com/office/word/2023/wordml/word16du" xmlns:w16sdtdh="http://schemas.microsoft.com/office/word/2020/wordml/sdtdatahash" xmlns:w16sdtfl="http://schemas.microsoft.com/office/word/2024/wordml/sdtformatlock" xmlns:w16se="http://schemas.microsoft.com/office/word/2015/wordml/symex" xmlns:wpg="http://schemas.microsoft.com/office/word/2010/wordprocessingGroup" xmlns:wpi="http://schemas.microsoft.com/office/word/2010/wordprocessingInk" xmlns:wne="http://schemas.microsoft.com/office/word/2006/wordml" xmlns:wps="http://schemas.microsoft.com/office/word/2010/wordprocessingShape" mc:Ignorable="w14 w15 w16se w16cid w16 w16cex w16sdtdh w16sdtfl w16du wp14">
   <w:body>
     <w:p>
       <w:pPr>
@@ -16,6 +16,9 @@
     </w:p>
     <w:p>
       <w:r>
+        <w:rPr>
+          <w:noProof/>
+        </w:rPr>
         <w:drawing>
           <wp:inline distT="0" distB="0" distL="0" distR="0" wp14:anchorId="00B65A11" wp14:editId="09CD9827">
             <wp:extent cx="5334744" cy="1181265"/>
@@ -66,15 +69,1657 @@
       </w:r>
     </w:p>
     <w:p>
-      <w:pPr>
-        <w:pStyle w:val="ListParagraph"/>
-        <w:numPr>
-          <w:ilvl w:val="0"/>
-          <w:numId w:val="1"/>
-        </w:numPr>
-      </w:pPr>
-      <w:bookmarkStart w:id="0" w:name="_GoBack"/>
-      <w:bookmarkEnd w:id="0"/>
+      <w:r>
+        <w:drawing>
+          <wp:inline distT="0" distB="0" distL="0" distR="0" wp14:anchorId="569A190B" wp14:editId="5FD0E1C4">
+            <wp:extent cx="5943600" cy="4037330"/>
+            <wp:effectExtent l="0" t="0" r="0" b="1270"/>
+            <wp:docPr id="668043591" name="Picture 1"/>
+            <wp:cNvGraphicFramePr>
+              <a:graphicFrameLocks xmlns:a="http://schemas.openxmlformats.org/drawingml/2006/main" noChangeAspect="1"/>
+            </wp:cNvGraphicFramePr>
+            <a:graphic xmlns:a="http://schemas.openxmlformats.org/drawingml/2006/main">
+              <a:graphicData uri="http://schemas.openxmlformats.org/drawingml/2006/picture">
+                <pic:pic xmlns:pic="http://schemas.openxmlformats.org/drawingml/2006/picture">
+                  <pic:nvPicPr>
+                    <pic:cNvPr id="668043591" name=""/>
+                    <pic:cNvPicPr/>
+                  </pic:nvPicPr>
+                  <pic:blipFill>
+                    <a:blip r:embed="rId6"/>
+                    <a:stretch>
+                      <a:fillRect/>
+                    </a:stretch>
+                  </pic:blipFill>
+                  <pic:spPr>
+                    <a:xfrm>
+                      <a:off x="0" y="0"/>
+                      <a:ext cx="5943600" cy="4037330"/>
+                    </a:xfrm>
+                    <a:prstGeom prst="rect">
+                      <a:avLst/>
+                    </a:prstGeom>
+                  </pic:spPr>
+                </pic:pic>
+              </a:graphicData>
+            </a:graphic>
+          </wp:inline>
+        </w:drawing>
+      </w:r>
+    </w:p>
+    <w:p>
+      <w:pPr>
+        <w:pStyle w:val="ListParagraph"/>
+        <w:numPr>
+          <w:ilvl w:val="0"/>
+          <w:numId w:val="1"/>
+        </w:numPr>
+      </w:pPr>
+      <w:r>
+        <w:t>docker pull nginx</w:t>
+      </w:r>
+    </w:p>
+    <w:p>
+      <w:r>
+        <w:drawing>
+          <wp:inline distT="0" distB="0" distL="0" distR="0" wp14:anchorId="7AEB1B59" wp14:editId="53374AA3">
+            <wp:extent cx="5943600" cy="978535"/>
+            <wp:effectExtent l="0" t="0" r="0" b="0"/>
+            <wp:docPr id="2028268723" name="Picture 1"/>
+            <wp:cNvGraphicFramePr>
+              <a:graphicFrameLocks xmlns:a="http://schemas.openxmlformats.org/drawingml/2006/main" noChangeAspect="1"/>
+            </wp:cNvGraphicFramePr>
+            <a:graphic xmlns:a="http://schemas.openxmlformats.org/drawingml/2006/main">
+              <a:graphicData uri="http://schemas.openxmlformats.org/drawingml/2006/picture">
+                <pic:pic xmlns:pic="http://schemas.openxmlformats.org/drawingml/2006/picture">
+                  <pic:nvPicPr>
+                    <pic:cNvPr id="2028268723" name=""/>
+                    <pic:cNvPicPr/>
+                  </pic:nvPicPr>
+                  <pic:blipFill>
+                    <a:blip r:embed="rId7"/>
+                    <a:stretch>
+                      <a:fillRect/>
+                    </a:stretch>
+                  </pic:blipFill>
+                  <pic:spPr>
+                    <a:xfrm>
+                      <a:off x="0" y="0"/>
+                      <a:ext cx="5943600" cy="978535"/>
+                    </a:xfrm>
+                    <a:prstGeom prst="rect">
+                      <a:avLst/>
+                    </a:prstGeom>
+                  </pic:spPr>
+                </pic:pic>
+              </a:graphicData>
+            </a:graphic>
+          </wp:inline>
+        </w:drawing>
+      </w:r>
+    </w:p>
+    <w:p>
+      <w:pPr>
+        <w:pStyle w:val="ListParagraph"/>
+        <w:numPr>
+          <w:ilvl w:val="0"/>
+          <w:numId w:val="1"/>
+        </w:numPr>
+      </w:pPr>
+      <w:r>
+        <w:t>docker images</w:t>
+      </w:r>
+    </w:p>
+    <w:p>
+      <w:r>
+        <w:lastRenderedPageBreak/>
+        <w:drawing>
+          <wp:inline distT="0" distB="0" distL="0" distR="0" wp14:anchorId="5B6EBC6B" wp14:editId="23D10628">
+            <wp:extent cx="5943600" cy="1729105"/>
+            <wp:effectExtent l="0" t="0" r="0" b="4445"/>
+            <wp:docPr id="1463811118" name="Picture 1"/>
+            <wp:cNvGraphicFramePr>
+              <a:graphicFrameLocks xmlns:a="http://schemas.openxmlformats.org/drawingml/2006/main" noChangeAspect="1"/>
+            </wp:cNvGraphicFramePr>
+            <a:graphic xmlns:a="http://schemas.openxmlformats.org/drawingml/2006/main">
+              <a:graphicData uri="http://schemas.openxmlformats.org/drawingml/2006/picture">
+                <pic:pic xmlns:pic="http://schemas.openxmlformats.org/drawingml/2006/picture">
+                  <pic:nvPicPr>
+                    <pic:cNvPr id="1463811118" name=""/>
+                    <pic:cNvPicPr/>
+                  </pic:nvPicPr>
+                  <pic:blipFill>
+                    <a:blip r:embed="rId8"/>
+                    <a:stretch>
+                      <a:fillRect/>
+                    </a:stretch>
+                  </pic:blipFill>
+                  <pic:spPr>
+                    <a:xfrm>
+                      <a:off x="0" y="0"/>
+                      <a:ext cx="5943600" cy="1729105"/>
+                    </a:xfrm>
+                    <a:prstGeom prst="rect">
+                      <a:avLst/>
+                    </a:prstGeom>
+                  </pic:spPr>
+                </pic:pic>
+              </a:graphicData>
+            </a:graphic>
+          </wp:inline>
+        </w:drawing>
+      </w:r>
+    </w:p>
+    <w:p>
+      <w:pPr>
+        <w:pStyle w:val="ListParagraph"/>
+        <w:numPr>
+          <w:ilvl w:val="0"/>
+          <w:numId w:val="1"/>
+        </w:numPr>
+      </w:pPr>
+      <w:r>
+        <w:t>docker run -d nginx</w:t>
+      </w:r>
+    </w:p>
+    <w:p>
+      <w:r>
+        <w:drawing>
+          <wp:inline distT="0" distB="0" distL="0" distR="0" wp14:anchorId="2CFF1851" wp14:editId="76608EC8">
+            <wp:extent cx="5943600" cy="506730"/>
+            <wp:effectExtent l="0" t="0" r="0" b="7620"/>
+            <wp:docPr id="1044249091" name="Picture 1"/>
+            <wp:cNvGraphicFramePr>
+              <a:graphicFrameLocks xmlns:a="http://schemas.openxmlformats.org/drawingml/2006/main" noChangeAspect="1"/>
+            </wp:cNvGraphicFramePr>
+            <a:graphic xmlns:a="http://schemas.openxmlformats.org/drawingml/2006/main">
+              <a:graphicData uri="http://schemas.openxmlformats.org/drawingml/2006/picture">
+                <pic:pic xmlns:pic="http://schemas.openxmlformats.org/drawingml/2006/picture">
+                  <pic:nvPicPr>
+                    <pic:cNvPr id="1044249091" name=""/>
+                    <pic:cNvPicPr/>
+                  </pic:nvPicPr>
+                  <pic:blipFill>
+                    <a:blip r:embed="rId9"/>
+                    <a:stretch>
+                      <a:fillRect/>
+                    </a:stretch>
+                  </pic:blipFill>
+                  <pic:spPr>
+                    <a:xfrm>
+                      <a:off x="0" y="0"/>
+                      <a:ext cx="5943600" cy="506730"/>
+                    </a:xfrm>
+                    <a:prstGeom prst="rect">
+                      <a:avLst/>
+                    </a:prstGeom>
+                  </pic:spPr>
+                </pic:pic>
+              </a:graphicData>
+            </a:graphic>
+          </wp:inline>
+        </w:drawing>
+      </w:r>
+    </w:p>
+    <w:p>
+      <w:pPr>
+        <w:pStyle w:val="ListParagraph"/>
+        <w:numPr>
+          <w:ilvl w:val="0"/>
+          <w:numId w:val="1"/>
+        </w:numPr>
+      </w:pPr>
+      <w:r>
+        <w:t>docker ps</w:t>
+      </w:r>
+    </w:p>
+    <w:p>
+      <w:r>
+        <w:drawing>
+          <wp:inline distT="0" distB="0" distL="0" distR="0" wp14:anchorId="22692D27" wp14:editId="1A85FFC7">
+            <wp:extent cx="5943600" cy="436245"/>
+            <wp:effectExtent l="0" t="0" r="0" b="1905"/>
+            <wp:docPr id="1463848872" name="Picture 1"/>
+            <wp:cNvGraphicFramePr>
+              <a:graphicFrameLocks xmlns:a="http://schemas.openxmlformats.org/drawingml/2006/main" noChangeAspect="1"/>
+            </wp:cNvGraphicFramePr>
+            <a:graphic xmlns:a="http://schemas.openxmlformats.org/drawingml/2006/main">
+              <a:graphicData uri="http://schemas.openxmlformats.org/drawingml/2006/picture">
+                <pic:pic xmlns:pic="http://schemas.openxmlformats.org/drawingml/2006/picture">
+                  <pic:nvPicPr>
+                    <pic:cNvPr id="1463848872" name=""/>
+                    <pic:cNvPicPr/>
+                  </pic:nvPicPr>
+                  <pic:blipFill>
+                    <a:blip r:embed="rId10"/>
+                    <a:stretch>
+                      <a:fillRect/>
+                    </a:stretch>
+                  </pic:blipFill>
+                  <pic:spPr>
+                    <a:xfrm>
+                      <a:off x="0" y="0"/>
+                      <a:ext cx="5943600" cy="436245"/>
+                    </a:xfrm>
+                    <a:prstGeom prst="rect">
+                      <a:avLst/>
+                    </a:prstGeom>
+                  </pic:spPr>
+                </pic:pic>
+              </a:graphicData>
+            </a:graphic>
+          </wp:inline>
+        </w:drawing>
+      </w:r>
+    </w:p>
+    <w:p>
+      <w:pPr>
+        <w:pStyle w:val="ListParagraph"/>
+        <w:numPr>
+          <w:ilvl w:val="0"/>
+          <w:numId w:val="1"/>
+        </w:numPr>
+      </w:pPr>
+      <w:r>
+        <w:t>docker ps -a</w:t>
+      </w:r>
+    </w:p>
+    <w:p>
+      <w:r>
+        <w:drawing>
+          <wp:inline distT="0" distB="0" distL="0" distR="0" wp14:anchorId="7D28FC31" wp14:editId="1CF82FD4">
+            <wp:extent cx="5943600" cy="1203960"/>
+            <wp:effectExtent l="0" t="0" r="0" b="0"/>
+            <wp:docPr id="230472744" name="Picture 1"/>
+            <wp:cNvGraphicFramePr>
+              <a:graphicFrameLocks xmlns:a="http://schemas.openxmlformats.org/drawingml/2006/main" noChangeAspect="1"/>
+            </wp:cNvGraphicFramePr>
+            <a:graphic xmlns:a="http://schemas.openxmlformats.org/drawingml/2006/main">
+              <a:graphicData uri="http://schemas.openxmlformats.org/drawingml/2006/picture">
+                <pic:pic xmlns:pic="http://schemas.openxmlformats.org/drawingml/2006/picture">
+                  <pic:nvPicPr>
+                    <pic:cNvPr id="230472744" name=""/>
+                    <pic:cNvPicPr/>
+                  </pic:nvPicPr>
+                  <pic:blipFill>
+                    <a:blip r:embed="rId11"/>
+                    <a:stretch>
+                      <a:fillRect/>
+                    </a:stretch>
+                  </pic:blipFill>
+                  <pic:spPr>
+                    <a:xfrm>
+                      <a:off x="0" y="0"/>
+                      <a:ext cx="5943600" cy="1203960"/>
+                    </a:xfrm>
+                    <a:prstGeom prst="rect">
+                      <a:avLst/>
+                    </a:prstGeom>
+                  </pic:spPr>
+                </pic:pic>
+              </a:graphicData>
+            </a:graphic>
+          </wp:inline>
+        </w:drawing>
+      </w:r>
+    </w:p>
+    <w:p>
+      <w:pPr>
+        <w:pStyle w:val="ListParagraph"/>
+        <w:numPr>
+          <w:ilvl w:val="0"/>
+          <w:numId w:val="1"/>
+        </w:numPr>
+      </w:pPr>
+      <w:r>
+        <w:t>docker logs &lt;container_id&gt;</w:t>
+      </w:r>
+    </w:p>
+    <w:p>
+      <w:r>
+        <w:lastRenderedPageBreak/>
+        <w:drawing>
+          <wp:inline distT="0" distB="0" distL="0" distR="0" wp14:anchorId="33DCBF7F" wp14:editId="6B4D58F2">
+            <wp:extent cx="5943600" cy="3347720"/>
+            <wp:effectExtent l="0" t="0" r="0" b="5080"/>
+            <wp:docPr id="1166206220" name="Picture 1"/>
+            <wp:cNvGraphicFramePr>
+              <a:graphicFrameLocks xmlns:a="http://schemas.openxmlformats.org/drawingml/2006/main" noChangeAspect="1"/>
+            </wp:cNvGraphicFramePr>
+            <a:graphic xmlns:a="http://schemas.openxmlformats.org/drawingml/2006/main">
+              <a:graphicData uri="http://schemas.openxmlformats.org/drawingml/2006/picture">
+                <pic:pic xmlns:pic="http://schemas.openxmlformats.org/drawingml/2006/picture">
+                  <pic:nvPicPr>
+                    <pic:cNvPr id="1166206220" name=""/>
+                    <pic:cNvPicPr/>
+                  </pic:nvPicPr>
+                  <pic:blipFill>
+                    <a:blip r:embed="rId12"/>
+                    <a:stretch>
+                      <a:fillRect/>
+                    </a:stretch>
+                  </pic:blipFill>
+                  <pic:spPr>
+                    <a:xfrm>
+                      <a:off x="0" y="0"/>
+                      <a:ext cx="5943600" cy="3347720"/>
+                    </a:xfrm>
+                    <a:prstGeom prst="rect">
+                      <a:avLst/>
+                    </a:prstGeom>
+                  </pic:spPr>
+                </pic:pic>
+              </a:graphicData>
+            </a:graphic>
+          </wp:inline>
+        </w:drawing>
+      </w:r>
+    </w:p>
+    <w:p>
+      <w:pPr>
+        <w:pStyle w:val="ListParagraph"/>
+        <w:numPr>
+          <w:ilvl w:val="0"/>
+          <w:numId w:val="1"/>
+        </w:numPr>
+      </w:pPr>
+      <w:r>
+        <w:t>docker exec -it &lt;container_id&gt; /bin/sh</w:t>
+      </w:r>
+      <w:r>
+        <w:t>\</w:t>
+      </w:r>
+    </w:p>
+    <w:p>
+      <w:r>
+        <w:drawing>
+          <wp:inline distT="0" distB="0" distL="0" distR="0" wp14:anchorId="2C703C20" wp14:editId="68BF67B9">
+            <wp:extent cx="5696745" cy="466790"/>
+            <wp:effectExtent l="0" t="0" r="0" b="9525"/>
+            <wp:docPr id="178143174" name="Picture 1"/>
+            <wp:cNvGraphicFramePr>
+              <a:graphicFrameLocks xmlns:a="http://schemas.openxmlformats.org/drawingml/2006/main" noChangeAspect="1"/>
+            </wp:cNvGraphicFramePr>
+            <a:graphic xmlns:a="http://schemas.openxmlformats.org/drawingml/2006/main">
+              <a:graphicData uri="http://schemas.openxmlformats.org/drawingml/2006/picture">
+                <pic:pic xmlns:pic="http://schemas.openxmlformats.org/drawingml/2006/picture">
+                  <pic:nvPicPr>
+                    <pic:cNvPr id="178143174" name=""/>
+                    <pic:cNvPicPr/>
+                  </pic:nvPicPr>
+                  <pic:blipFill>
+                    <a:blip r:embed="rId13"/>
+                    <a:stretch>
+                      <a:fillRect/>
+                    </a:stretch>
+                  </pic:blipFill>
+                  <pic:spPr>
+                    <a:xfrm>
+                      <a:off x="0" y="0"/>
+                      <a:ext cx="5696745" cy="466790"/>
+                    </a:xfrm>
+                    <a:prstGeom prst="rect">
+                      <a:avLst/>
+                    </a:prstGeom>
+                  </pic:spPr>
+                </pic:pic>
+              </a:graphicData>
+            </a:graphic>
+          </wp:inline>
+        </w:drawing>
+      </w:r>
+    </w:p>
+    <w:p>
+      <w:pPr>
+        <w:pStyle w:val="ListParagraph"/>
+        <w:numPr>
+          <w:ilvl w:val="0"/>
+          <w:numId w:val="1"/>
+        </w:numPr>
+      </w:pPr>
+      <w:r>
+        <w:t xml:space="preserve"> </w:t>
+      </w:r>
+      <w:r>
+        <w:t>docker stop &lt;container_id&gt;</w:t>
+      </w:r>
+    </w:p>
+    <w:p>
+      <w:r>
+        <w:drawing>
+          <wp:inline distT="0" distB="0" distL="0" distR="0" wp14:anchorId="5A1AE4C6" wp14:editId="1EE4F000">
+            <wp:extent cx="5943600" cy="422910"/>
+            <wp:effectExtent l="0" t="0" r="0" b="0"/>
+            <wp:docPr id="455194063" name="Picture 1"/>
+            <wp:cNvGraphicFramePr>
+              <a:graphicFrameLocks xmlns:a="http://schemas.openxmlformats.org/drawingml/2006/main" noChangeAspect="1"/>
+            </wp:cNvGraphicFramePr>
+            <a:graphic xmlns:a="http://schemas.openxmlformats.org/drawingml/2006/main">
+              <a:graphicData uri="http://schemas.openxmlformats.org/drawingml/2006/picture">
+                <pic:pic xmlns:pic="http://schemas.openxmlformats.org/drawingml/2006/picture">
+                  <pic:nvPicPr>
+                    <pic:cNvPr id="455194063" name=""/>
+                    <pic:cNvPicPr/>
+                  </pic:nvPicPr>
+                  <pic:blipFill>
+                    <a:blip r:embed="rId14"/>
+                    <a:stretch>
+                      <a:fillRect/>
+                    </a:stretch>
+                  </pic:blipFill>
+                  <pic:spPr>
+                    <a:xfrm>
+                      <a:off x="0" y="0"/>
+                      <a:ext cx="5943600" cy="422910"/>
+                    </a:xfrm>
+                    <a:prstGeom prst="rect">
+                      <a:avLst/>
+                    </a:prstGeom>
+                  </pic:spPr>
+                </pic:pic>
+              </a:graphicData>
+            </a:graphic>
+          </wp:inline>
+        </w:drawing>
+      </w:r>
+    </w:p>
+    <w:p>
+      <w:pPr>
+        <w:pStyle w:val="ListParagraph"/>
+        <w:numPr>
+          <w:ilvl w:val="0"/>
+          <w:numId w:val="1"/>
+        </w:numPr>
+      </w:pPr>
+      <w:r>
+        <w:t xml:space="preserve"> </w:t>
+      </w:r>
+      <w:r>
+        <w:t>docker restart &lt;container_id&gt;</w:t>
+      </w:r>
+    </w:p>
+    <w:p>
+      <w:r>
+        <w:drawing>
+          <wp:inline distT="0" distB="0" distL="0" distR="0" wp14:anchorId="242D4BC2" wp14:editId="464E0D0E">
+            <wp:extent cx="5943600" cy="313055"/>
+            <wp:effectExtent l="0" t="0" r="0" b="0"/>
+            <wp:docPr id="1404206518" name="Picture 1"/>
+            <wp:cNvGraphicFramePr>
+              <a:graphicFrameLocks xmlns:a="http://schemas.openxmlformats.org/drawingml/2006/main" noChangeAspect="1"/>
+            </wp:cNvGraphicFramePr>
+            <a:graphic xmlns:a="http://schemas.openxmlformats.org/drawingml/2006/main">
+              <a:graphicData uri="http://schemas.openxmlformats.org/drawingml/2006/picture">
+                <pic:pic xmlns:pic="http://schemas.openxmlformats.org/drawingml/2006/picture">
+                  <pic:nvPicPr>
+                    <pic:cNvPr id="1404206518" name=""/>
+                    <pic:cNvPicPr/>
+                  </pic:nvPicPr>
+                  <pic:blipFill>
+                    <a:blip r:embed="rId15"/>
+                    <a:stretch>
+                      <a:fillRect/>
+                    </a:stretch>
+                  </pic:blipFill>
+                  <pic:spPr>
+                    <a:xfrm>
+                      <a:off x="0" y="0"/>
+                      <a:ext cx="5943600" cy="313055"/>
+                    </a:xfrm>
+                    <a:prstGeom prst="rect">
+                      <a:avLst/>
+                    </a:prstGeom>
+                  </pic:spPr>
+                </pic:pic>
+              </a:graphicData>
+            </a:graphic>
+          </wp:inline>
+        </w:drawing>
+      </w:r>
+    </w:p>
+    <w:p>
+      <w:pPr>
+        <w:pStyle w:val="ListParagraph"/>
+        <w:numPr>
+          <w:ilvl w:val="0"/>
+          <w:numId w:val="1"/>
+        </w:numPr>
+      </w:pPr>
+      <w:r>
+        <w:t xml:space="preserve"> </w:t>
+      </w:r>
+      <w:r>
+        <w:t>docker rm &lt;container_id&gt;</w:t>
+      </w:r>
+    </w:p>
+    <w:p>
+      <w:r>
+        <w:drawing>
+          <wp:inline distT="0" distB="0" distL="0" distR="0" wp14:anchorId="48029818" wp14:editId="244D8C5A">
+            <wp:extent cx="5943600" cy="349885"/>
+            <wp:effectExtent l="0" t="0" r="0" b="0"/>
+            <wp:docPr id="1161651629" name="Picture 1"/>
+            <wp:cNvGraphicFramePr>
+              <a:graphicFrameLocks xmlns:a="http://schemas.openxmlformats.org/drawingml/2006/main" noChangeAspect="1"/>
+            </wp:cNvGraphicFramePr>
+            <a:graphic xmlns:a="http://schemas.openxmlformats.org/drawingml/2006/main">
+              <a:graphicData uri="http://schemas.openxmlformats.org/drawingml/2006/picture">
+                <pic:pic xmlns:pic="http://schemas.openxmlformats.org/drawingml/2006/picture">
+                  <pic:nvPicPr>
+                    <pic:cNvPr id="1161651629" name=""/>
+                    <pic:cNvPicPr/>
+                  </pic:nvPicPr>
+                  <pic:blipFill>
+                    <a:blip r:embed="rId16"/>
+                    <a:stretch>
+                      <a:fillRect/>
+                    </a:stretch>
+                  </pic:blipFill>
+                  <pic:spPr>
+                    <a:xfrm>
+                      <a:off x="0" y="0"/>
+                      <a:ext cx="5943600" cy="349885"/>
+                    </a:xfrm>
+                    <a:prstGeom prst="rect">
+                      <a:avLst/>
+                    </a:prstGeom>
+                  </pic:spPr>
+                </pic:pic>
+              </a:graphicData>
+            </a:graphic>
+          </wp:inline>
+        </w:drawing>
+      </w:r>
+    </w:p>
+    <w:p>
+      <w:pPr>
+        <w:pStyle w:val="ListParagraph"/>
+        <w:numPr>
+          <w:ilvl w:val="0"/>
+          <w:numId w:val="1"/>
+        </w:numPr>
+      </w:pPr>
+      <w:r>
+        <w:t xml:space="preserve"> </w:t>
+      </w:r>
+      <w:r>
+        <w:t>docker container prune</w:t>
+      </w:r>
+    </w:p>
+    <w:p>
+      <w:r>
+        <w:lastRenderedPageBreak/>
+        <w:drawing>
+          <wp:inline distT="0" distB="0" distL="0" distR="0" wp14:anchorId="19EBE9D2" wp14:editId="56F1A76B">
+            <wp:extent cx="5943600" cy="1783715"/>
+            <wp:effectExtent l="0" t="0" r="0" b="6985"/>
+            <wp:docPr id="247457395" name="Picture 1"/>
+            <wp:cNvGraphicFramePr>
+              <a:graphicFrameLocks xmlns:a="http://schemas.openxmlformats.org/drawingml/2006/main" noChangeAspect="1"/>
+            </wp:cNvGraphicFramePr>
+            <a:graphic xmlns:a="http://schemas.openxmlformats.org/drawingml/2006/main">
+              <a:graphicData uri="http://schemas.openxmlformats.org/drawingml/2006/picture">
+                <pic:pic xmlns:pic="http://schemas.openxmlformats.org/drawingml/2006/picture">
+                  <pic:nvPicPr>
+                    <pic:cNvPr id="247457395" name=""/>
+                    <pic:cNvPicPr/>
+                  </pic:nvPicPr>
+                  <pic:blipFill>
+                    <a:blip r:embed="rId17"/>
+                    <a:stretch>
+                      <a:fillRect/>
+                    </a:stretch>
+                  </pic:blipFill>
+                  <pic:spPr>
+                    <a:xfrm>
+                      <a:off x="0" y="0"/>
+                      <a:ext cx="5943600" cy="1783715"/>
+                    </a:xfrm>
+                    <a:prstGeom prst="rect">
+                      <a:avLst/>
+                    </a:prstGeom>
+                  </pic:spPr>
+                </pic:pic>
+              </a:graphicData>
+            </a:graphic>
+          </wp:inline>
+        </w:drawing>
+      </w:r>
+    </w:p>
+    <w:p>
+      <w:pPr>
+        <w:pStyle w:val="ListParagraph"/>
+        <w:numPr>
+          <w:ilvl w:val="0"/>
+          <w:numId w:val="1"/>
+        </w:numPr>
+      </w:pPr>
+      <w:r>
+        <w:t xml:space="preserve"> </w:t>
+      </w:r>
+      <w:r>
+        <w:t>docker rmi &lt;image_id&gt;</w:t>
+      </w:r>
+    </w:p>
+    <w:p>
+      <w:r>
+        <w:drawing>
+          <wp:inline distT="0" distB="0" distL="0" distR="0" wp14:anchorId="39C45C5E" wp14:editId="0B6BD606">
+            <wp:extent cx="5943600" cy="380365"/>
+            <wp:effectExtent l="0" t="0" r="0" b="635"/>
+            <wp:docPr id="629077534" name="Picture 1"/>
+            <wp:cNvGraphicFramePr>
+              <a:graphicFrameLocks xmlns:a="http://schemas.openxmlformats.org/drawingml/2006/main" noChangeAspect="1"/>
+            </wp:cNvGraphicFramePr>
+            <a:graphic xmlns:a="http://schemas.openxmlformats.org/drawingml/2006/main">
+              <a:graphicData uri="http://schemas.openxmlformats.org/drawingml/2006/picture">
+                <pic:pic xmlns:pic="http://schemas.openxmlformats.org/drawingml/2006/picture">
+                  <pic:nvPicPr>
+                    <pic:cNvPr id="629077534" name=""/>
+                    <pic:cNvPicPr/>
+                  </pic:nvPicPr>
+                  <pic:blipFill>
+                    <a:blip r:embed="rId18"/>
+                    <a:stretch>
+                      <a:fillRect/>
+                    </a:stretch>
+                  </pic:blipFill>
+                  <pic:spPr>
+                    <a:xfrm>
+                      <a:off x="0" y="0"/>
+                      <a:ext cx="5943600" cy="380365"/>
+                    </a:xfrm>
+                    <a:prstGeom prst="rect">
+                      <a:avLst/>
+                    </a:prstGeom>
+                  </pic:spPr>
+                </pic:pic>
+              </a:graphicData>
+            </a:graphic>
+          </wp:inline>
+        </w:drawing>
+      </w:r>
+    </w:p>
+    <w:p>
+      <w:pPr>
+        <w:pStyle w:val="ListParagraph"/>
+        <w:numPr>
+          <w:ilvl w:val="0"/>
+          <w:numId w:val="1"/>
+        </w:numPr>
+      </w:pPr>
+      <w:r>
+        <w:t xml:space="preserve"> </w:t>
+      </w:r>
+      <w:r>
+        <w:t>docker image prune -a</w:t>
+      </w:r>
+    </w:p>
+    <w:p>
+      <w:r>
+        <w:drawing>
+          <wp:inline distT="0" distB="0" distL="0" distR="0" wp14:anchorId="7AAD41F4" wp14:editId="0E4D9A05">
+            <wp:extent cx="5943600" cy="3194685"/>
+            <wp:effectExtent l="0" t="0" r="0" b="5715"/>
+            <wp:docPr id="1229375767" name="Picture 1"/>
+            <wp:cNvGraphicFramePr>
+              <a:graphicFrameLocks xmlns:a="http://schemas.openxmlformats.org/drawingml/2006/main" noChangeAspect="1"/>
+            </wp:cNvGraphicFramePr>
+            <a:graphic xmlns:a="http://schemas.openxmlformats.org/drawingml/2006/main">
+              <a:graphicData uri="http://schemas.openxmlformats.org/drawingml/2006/picture">
+                <pic:pic xmlns:pic="http://schemas.openxmlformats.org/drawingml/2006/picture">
+                  <pic:nvPicPr>
+                    <pic:cNvPr id="1229375767" name=""/>
+                    <pic:cNvPicPr/>
+                  </pic:nvPicPr>
+                  <pic:blipFill>
+                    <a:blip r:embed="rId19"/>
+                    <a:stretch>
+                      <a:fillRect/>
+                    </a:stretch>
+                  </pic:blipFill>
+                  <pic:spPr>
+                    <a:xfrm>
+                      <a:off x="0" y="0"/>
+                      <a:ext cx="5943600" cy="3194685"/>
+                    </a:xfrm>
+                    <a:prstGeom prst="rect">
+                      <a:avLst/>
+                    </a:prstGeom>
+                  </pic:spPr>
+                </pic:pic>
+              </a:graphicData>
+            </a:graphic>
+          </wp:inline>
+        </w:drawing>
+      </w:r>
+    </w:p>
+    <w:p>
+      <w:pPr>
+        <w:pStyle w:val="ListParagraph"/>
+        <w:numPr>
+          <w:ilvl w:val="0"/>
+          <w:numId w:val="1"/>
+        </w:numPr>
+      </w:pPr>
+      <w:r>
+        <w:t xml:space="preserve"> </w:t>
+      </w:r>
+      <w:r>
+        <w:t>docker run -d -p 8080:80 nginx</w:t>
+      </w:r>
+    </w:p>
+    <w:p>
+      <w:r>
+        <w:lastRenderedPageBreak/>
+        <w:drawing>
+          <wp:inline distT="0" distB="0" distL="0" distR="0" wp14:anchorId="6F6F0256" wp14:editId="63FC5BF9">
+            <wp:extent cx="5943600" cy="3347720"/>
+            <wp:effectExtent l="0" t="0" r="0" b="5080"/>
+            <wp:docPr id="1969907244" name="Picture 1"/>
+            <wp:cNvGraphicFramePr>
+              <a:graphicFrameLocks xmlns:a="http://schemas.openxmlformats.org/drawingml/2006/main" noChangeAspect="1"/>
+            </wp:cNvGraphicFramePr>
+            <a:graphic xmlns:a="http://schemas.openxmlformats.org/drawingml/2006/main">
+              <a:graphicData uri="http://schemas.openxmlformats.org/drawingml/2006/picture">
+                <pic:pic xmlns:pic="http://schemas.openxmlformats.org/drawingml/2006/picture">
+                  <pic:nvPicPr>
+                    <pic:cNvPr id="1969907244" name=""/>
+                    <pic:cNvPicPr/>
+                  </pic:nvPicPr>
+                  <pic:blipFill>
+                    <a:blip r:embed="rId20"/>
+                    <a:stretch>
+                      <a:fillRect/>
+                    </a:stretch>
+                  </pic:blipFill>
+                  <pic:spPr>
+                    <a:xfrm>
+                      <a:off x="0" y="0"/>
+                      <a:ext cx="5943600" cy="3347720"/>
+                    </a:xfrm>
+                    <a:prstGeom prst="rect">
+                      <a:avLst/>
+                    </a:prstGeom>
+                  </pic:spPr>
+                </pic:pic>
+              </a:graphicData>
+            </a:graphic>
+          </wp:inline>
+        </w:drawing>
+      </w:r>
+    </w:p>
+    <w:p>
+      <w:pPr>
+        <w:pStyle w:val="ListParagraph"/>
+        <w:numPr>
+          <w:ilvl w:val="0"/>
+          <w:numId w:val="1"/>
+        </w:numPr>
+      </w:pPr>
+      <w:r>
+        <w:t xml:space="preserve"> </w:t>
+      </w:r>
+      <w:r>
+        <w:t>docker inspect &lt;container_id&gt;</w:t>
+      </w:r>
+    </w:p>
+    <w:p>
+      <w:r>
+        <w:drawing>
+          <wp:inline distT="0" distB="0" distL="0" distR="0" wp14:anchorId="106773DD" wp14:editId="650DBD30">
+            <wp:extent cx="5943600" cy="3194685"/>
+            <wp:effectExtent l="0" t="0" r="0" b="5715"/>
+            <wp:docPr id="888025861" name="Picture 1"/>
+            <wp:cNvGraphicFramePr>
+              <a:graphicFrameLocks xmlns:a="http://schemas.openxmlformats.org/drawingml/2006/main" noChangeAspect="1"/>
+            </wp:cNvGraphicFramePr>
+            <a:graphic xmlns:a="http://schemas.openxmlformats.org/drawingml/2006/main">
+              <a:graphicData uri="http://schemas.openxmlformats.org/drawingml/2006/picture">
+                <pic:pic xmlns:pic="http://schemas.openxmlformats.org/drawingml/2006/picture">
+                  <pic:nvPicPr>
+                    <pic:cNvPr id="888025861" name=""/>
+                    <pic:cNvPicPr/>
+                  </pic:nvPicPr>
+                  <pic:blipFill>
+                    <a:blip r:embed="rId21"/>
+                    <a:stretch>
+                      <a:fillRect/>
+                    </a:stretch>
+                  </pic:blipFill>
+                  <pic:spPr>
+                    <a:xfrm>
+                      <a:off x="0" y="0"/>
+                      <a:ext cx="5943600" cy="3194685"/>
+                    </a:xfrm>
+                    <a:prstGeom prst="rect">
+                      <a:avLst/>
+                    </a:prstGeom>
+                  </pic:spPr>
+                </pic:pic>
+              </a:graphicData>
+            </a:graphic>
+          </wp:inline>
+        </w:drawing>
+      </w:r>
+    </w:p>
+    <w:p>
+      <w:pPr>
+        <w:pStyle w:val="ListParagraph"/>
+        <w:numPr>
+          <w:ilvl w:val="0"/>
+          <w:numId w:val="1"/>
+        </w:numPr>
+      </w:pPr>
+      <w:r>
+        <w:t xml:space="preserve"> </w:t>
+      </w:r>
+      <w:r>
+        <w:t>docker run -d -v mydata:/data nginx</w:t>
+      </w:r>
+    </w:p>
+    <w:p>
+      <w:r>
+        <w:drawing>
+          <wp:inline distT="0" distB="0" distL="0" distR="0" wp14:anchorId="63C4BAF0" wp14:editId="2E7866D5">
+            <wp:extent cx="5943600" cy="441960"/>
+            <wp:effectExtent l="0" t="0" r="0" b="0"/>
+            <wp:docPr id="2022568915" name="Picture 1"/>
+            <wp:cNvGraphicFramePr>
+              <a:graphicFrameLocks xmlns:a="http://schemas.openxmlformats.org/drawingml/2006/main" noChangeAspect="1"/>
+            </wp:cNvGraphicFramePr>
+            <a:graphic xmlns:a="http://schemas.openxmlformats.org/drawingml/2006/main">
+              <a:graphicData uri="http://schemas.openxmlformats.org/drawingml/2006/picture">
+                <pic:pic xmlns:pic="http://schemas.openxmlformats.org/drawingml/2006/picture">
+                  <pic:nvPicPr>
+                    <pic:cNvPr id="2022568915" name=""/>
+                    <pic:cNvPicPr/>
+                  </pic:nvPicPr>
+                  <pic:blipFill>
+                    <a:blip r:embed="rId22"/>
+                    <a:stretch>
+                      <a:fillRect/>
+                    </a:stretch>
+                  </pic:blipFill>
+                  <pic:spPr>
+                    <a:xfrm>
+                      <a:off x="0" y="0"/>
+                      <a:ext cx="5943600" cy="441960"/>
+                    </a:xfrm>
+                    <a:prstGeom prst="rect">
+                      <a:avLst/>
+                    </a:prstGeom>
+                  </pic:spPr>
+                </pic:pic>
+              </a:graphicData>
+            </a:graphic>
+          </wp:inline>
+        </w:drawing>
+      </w:r>
+    </w:p>
+    <w:p>
+      <w:pPr>
+        <w:pStyle w:val="ListParagraph"/>
+        <w:numPr>
+          <w:ilvl w:val="0"/>
+          <w:numId w:val="1"/>
+        </w:numPr>
+      </w:pPr>
+      <w:r>
+        <w:lastRenderedPageBreak/>
+        <w:t xml:space="preserve"> </w:t>
+      </w:r>
+      <w:r>
+        <w:t>docker volume ls</w:t>
+      </w:r>
+    </w:p>
+    <w:p>
+      <w:r>
+        <w:drawing>
+          <wp:inline distT="0" distB="0" distL="0" distR="0" wp14:anchorId="51025D16" wp14:editId="50374623">
+            <wp:extent cx="5943600" cy="2414270"/>
+            <wp:effectExtent l="0" t="0" r="0" b="5080"/>
+            <wp:docPr id="1534280644" name="Picture 1"/>
+            <wp:cNvGraphicFramePr>
+              <a:graphicFrameLocks xmlns:a="http://schemas.openxmlformats.org/drawingml/2006/main" noChangeAspect="1"/>
+            </wp:cNvGraphicFramePr>
+            <a:graphic xmlns:a="http://schemas.openxmlformats.org/drawingml/2006/main">
+              <a:graphicData uri="http://schemas.openxmlformats.org/drawingml/2006/picture">
+                <pic:pic xmlns:pic="http://schemas.openxmlformats.org/drawingml/2006/picture">
+                  <pic:nvPicPr>
+                    <pic:cNvPr id="1534280644" name=""/>
+                    <pic:cNvPicPr/>
+                  </pic:nvPicPr>
+                  <pic:blipFill>
+                    <a:blip r:embed="rId23"/>
+                    <a:stretch>
+                      <a:fillRect/>
+                    </a:stretch>
+                  </pic:blipFill>
+                  <pic:spPr>
+                    <a:xfrm>
+                      <a:off x="0" y="0"/>
+                      <a:ext cx="5943600" cy="2414270"/>
+                    </a:xfrm>
+                    <a:prstGeom prst="rect">
+                      <a:avLst/>
+                    </a:prstGeom>
+                  </pic:spPr>
+                </pic:pic>
+              </a:graphicData>
+            </a:graphic>
+          </wp:inline>
+        </w:drawing>
+      </w:r>
+    </w:p>
+    <w:p>
+      <w:pPr>
+        <w:pStyle w:val="ListParagraph"/>
+        <w:numPr>
+          <w:ilvl w:val="0"/>
+          <w:numId w:val="1"/>
+        </w:numPr>
+      </w:pPr>
+      <w:r>
+        <w:t xml:space="preserve"> </w:t>
+      </w:r>
+      <w:r>
+        <w:t>docker volume prune</w:t>
+      </w:r>
+    </w:p>
+    <w:p>
+      <w:r>
+        <w:drawing>
+          <wp:inline distT="0" distB="0" distL="0" distR="0" wp14:anchorId="58176AAD" wp14:editId="7F96AB4D">
+            <wp:extent cx="5943600" cy="3841115"/>
+            <wp:effectExtent l="0" t="0" r="0" b="6985"/>
+            <wp:docPr id="1571733446" name="Picture 1"/>
+            <wp:cNvGraphicFramePr>
+              <a:graphicFrameLocks xmlns:a="http://schemas.openxmlformats.org/drawingml/2006/main" noChangeAspect="1"/>
+            </wp:cNvGraphicFramePr>
+            <a:graphic xmlns:a="http://schemas.openxmlformats.org/drawingml/2006/main">
+              <a:graphicData uri="http://schemas.openxmlformats.org/drawingml/2006/picture">
+                <pic:pic xmlns:pic="http://schemas.openxmlformats.org/drawingml/2006/picture">
+                  <pic:nvPicPr>
+                    <pic:cNvPr id="1571733446" name=""/>
+                    <pic:cNvPicPr/>
+                  </pic:nvPicPr>
+                  <pic:blipFill>
+                    <a:blip r:embed="rId24"/>
+                    <a:stretch>
+                      <a:fillRect/>
+                    </a:stretch>
+                  </pic:blipFill>
+                  <pic:spPr>
+                    <a:xfrm>
+                      <a:off x="0" y="0"/>
+                      <a:ext cx="5943600" cy="3841115"/>
+                    </a:xfrm>
+                    <a:prstGeom prst="rect">
+                      <a:avLst/>
+                    </a:prstGeom>
+                  </pic:spPr>
+                </pic:pic>
+              </a:graphicData>
+            </a:graphic>
+          </wp:inline>
+        </w:drawing>
+      </w:r>
+    </w:p>
+    <w:p>
+      <w:pPr>
+        <w:pStyle w:val="ListParagraph"/>
+        <w:numPr>
+          <w:ilvl w:val="0"/>
+          <w:numId w:val="1"/>
+        </w:numPr>
+      </w:pPr>
+      <w:r>
+        <w:t xml:space="preserve"> </w:t>
+      </w:r>
+      <w:r>
+        <w:t>docker run -d --name my_nginx nginx</w:t>
+      </w:r>
+    </w:p>
+    <w:p>
+      <w:r>
+        <w:lastRenderedPageBreak/>
+        <w:drawing>
+          <wp:inline distT="0" distB="0" distL="0" distR="0" wp14:anchorId="61117188" wp14:editId="07A10226">
+            <wp:extent cx="5943600" cy="476885"/>
+            <wp:effectExtent l="0" t="0" r="0" b="0"/>
+            <wp:docPr id="1383340127" name="Picture 1"/>
+            <wp:cNvGraphicFramePr>
+              <a:graphicFrameLocks xmlns:a="http://schemas.openxmlformats.org/drawingml/2006/main" noChangeAspect="1"/>
+            </wp:cNvGraphicFramePr>
+            <a:graphic xmlns:a="http://schemas.openxmlformats.org/drawingml/2006/main">
+              <a:graphicData uri="http://schemas.openxmlformats.org/drawingml/2006/picture">
+                <pic:pic xmlns:pic="http://schemas.openxmlformats.org/drawingml/2006/picture">
+                  <pic:nvPicPr>
+                    <pic:cNvPr id="1383340127" name=""/>
+                    <pic:cNvPicPr/>
+                  </pic:nvPicPr>
+                  <pic:blipFill>
+                    <a:blip r:embed="rId25"/>
+                    <a:stretch>
+                      <a:fillRect/>
+                    </a:stretch>
+                  </pic:blipFill>
+                  <pic:spPr>
+                    <a:xfrm>
+                      <a:off x="0" y="0"/>
+                      <a:ext cx="5943600" cy="476885"/>
+                    </a:xfrm>
+                    <a:prstGeom prst="rect">
+                      <a:avLst/>
+                    </a:prstGeom>
+                  </pic:spPr>
+                </pic:pic>
+              </a:graphicData>
+            </a:graphic>
+          </wp:inline>
+        </w:drawing>
+      </w:r>
+    </w:p>
+    <w:p>
+      <w:pPr>
+        <w:pStyle w:val="ListParagraph"/>
+        <w:numPr>
+          <w:ilvl w:val="0"/>
+          <w:numId w:val="1"/>
+        </w:numPr>
+      </w:pPr>
+      <w:r>
+        <w:t xml:space="preserve"> </w:t>
+      </w:r>
+      <w:r>
+        <w:t>docker stats</w:t>
+      </w:r>
+    </w:p>
+    <w:p>
+      <w:r>
+        <w:drawing>
+          <wp:inline distT="0" distB="0" distL="0" distR="0" wp14:anchorId="071752CD" wp14:editId="2E5E4439">
+            <wp:extent cx="5943600" cy="758825"/>
+            <wp:effectExtent l="0" t="0" r="0" b="3175"/>
+            <wp:docPr id="529632755" name="Picture 1"/>
+            <wp:cNvGraphicFramePr>
+              <a:graphicFrameLocks xmlns:a="http://schemas.openxmlformats.org/drawingml/2006/main" noChangeAspect="1"/>
+            </wp:cNvGraphicFramePr>
+            <a:graphic xmlns:a="http://schemas.openxmlformats.org/drawingml/2006/main">
+              <a:graphicData uri="http://schemas.openxmlformats.org/drawingml/2006/picture">
+                <pic:pic xmlns:pic="http://schemas.openxmlformats.org/drawingml/2006/picture">
+                  <pic:nvPicPr>
+                    <pic:cNvPr id="529632755" name=""/>
+                    <pic:cNvPicPr/>
+                  </pic:nvPicPr>
+                  <pic:blipFill>
+                    <a:blip r:embed="rId26"/>
+                    <a:stretch>
+                      <a:fillRect/>
+                    </a:stretch>
+                  </pic:blipFill>
+                  <pic:spPr>
+                    <a:xfrm>
+                      <a:off x="0" y="0"/>
+                      <a:ext cx="5943600" cy="758825"/>
+                    </a:xfrm>
+                    <a:prstGeom prst="rect">
+                      <a:avLst/>
+                    </a:prstGeom>
+                  </pic:spPr>
+                </pic:pic>
+              </a:graphicData>
+            </a:graphic>
+          </wp:inline>
+        </w:drawing>
+      </w:r>
+    </w:p>
+    <w:p>
+      <w:pPr>
+        <w:pStyle w:val="ListParagraph"/>
+        <w:numPr>
+          <w:ilvl w:val="0"/>
+          <w:numId w:val="1"/>
+        </w:numPr>
+      </w:pPr>
+      <w:r>
+        <w:t xml:space="preserve"> </w:t>
+      </w:r>
+      <w:r>
+        <w:t>docker network ls</w:t>
+      </w:r>
+    </w:p>
+    <w:p>
+      <w:r>
+        <w:drawing>
+          <wp:inline distT="0" distB="0" distL="0" distR="0" wp14:anchorId="156A7D1E" wp14:editId="52BEACB8">
+            <wp:extent cx="5943600" cy="1202690"/>
+            <wp:effectExtent l="0" t="0" r="0" b="0"/>
+            <wp:docPr id="545346931" name="Picture 1"/>
+            <wp:cNvGraphicFramePr>
+              <a:graphicFrameLocks xmlns:a="http://schemas.openxmlformats.org/drawingml/2006/main" noChangeAspect="1"/>
+            </wp:cNvGraphicFramePr>
+            <a:graphic xmlns:a="http://schemas.openxmlformats.org/drawingml/2006/main">
+              <a:graphicData uri="http://schemas.openxmlformats.org/drawingml/2006/picture">
+                <pic:pic xmlns:pic="http://schemas.openxmlformats.org/drawingml/2006/picture">
+                  <pic:nvPicPr>
+                    <pic:cNvPr id="545346931" name=""/>
+                    <pic:cNvPicPr/>
+                  </pic:nvPicPr>
+                  <pic:blipFill>
+                    <a:blip r:embed="rId27"/>
+                    <a:stretch>
+                      <a:fillRect/>
+                    </a:stretch>
+                  </pic:blipFill>
+                  <pic:spPr>
+                    <a:xfrm>
+                      <a:off x="0" y="0"/>
+                      <a:ext cx="5943600" cy="1202690"/>
+                    </a:xfrm>
+                    <a:prstGeom prst="rect">
+                      <a:avLst/>
+                    </a:prstGeom>
+                  </pic:spPr>
+                </pic:pic>
+              </a:graphicData>
+            </a:graphic>
+          </wp:inline>
+        </w:drawing>
+      </w:r>
+    </w:p>
+    <w:p>
+      <w:pPr>
+        <w:pStyle w:val="ListParagraph"/>
+        <w:numPr>
+          <w:ilvl w:val="0"/>
+          <w:numId w:val="1"/>
+        </w:numPr>
+      </w:pPr>
+      <w:r>
+        <w:t xml:space="preserve"> </w:t>
+      </w:r>
+      <w:r>
+        <w:t>docker network create my_network</w:t>
+      </w:r>
+    </w:p>
+    <w:p>
+      <w:r>
+        <w:drawing>
+          <wp:inline distT="0" distB="0" distL="0" distR="0" wp14:anchorId="611C9AE3" wp14:editId="07CE2A91">
+            <wp:extent cx="5943600" cy="514985"/>
+            <wp:effectExtent l="0" t="0" r="0" b="0"/>
+            <wp:docPr id="779918344" name="Picture 1"/>
+            <wp:cNvGraphicFramePr>
+              <a:graphicFrameLocks xmlns:a="http://schemas.openxmlformats.org/drawingml/2006/main" noChangeAspect="1"/>
+            </wp:cNvGraphicFramePr>
+            <a:graphic xmlns:a="http://schemas.openxmlformats.org/drawingml/2006/main">
+              <a:graphicData uri="http://schemas.openxmlformats.org/drawingml/2006/picture">
+                <pic:pic xmlns:pic="http://schemas.openxmlformats.org/drawingml/2006/picture">
+                  <pic:nvPicPr>
+                    <pic:cNvPr id="779918344" name=""/>
+                    <pic:cNvPicPr/>
+                  </pic:nvPicPr>
+                  <pic:blipFill>
+                    <a:blip r:embed="rId28"/>
+                    <a:stretch>
+                      <a:fillRect/>
+                    </a:stretch>
+                  </pic:blipFill>
+                  <pic:spPr>
+                    <a:xfrm>
+                      <a:off x="0" y="0"/>
+                      <a:ext cx="5943600" cy="514985"/>
+                    </a:xfrm>
+                    <a:prstGeom prst="rect">
+                      <a:avLst/>
+                    </a:prstGeom>
+                  </pic:spPr>
+                </pic:pic>
+              </a:graphicData>
+            </a:graphic>
+          </wp:inline>
+        </w:drawing>
+      </w:r>
+    </w:p>
+    <w:p>
+      <w:pPr>
+        <w:pStyle w:val="ListParagraph"/>
+        <w:numPr>
+          <w:ilvl w:val="0"/>
+          <w:numId w:val="1"/>
+        </w:numPr>
+      </w:pPr>
+      <w:r>
+        <w:t xml:space="preserve"> </w:t>
+      </w:r>
+      <w:r>
+        <w:t>docker run -d --network my_network --name my_container nginx</w:t>
+      </w:r>
+    </w:p>
+    <w:p>
+      <w:r>
+        <w:drawing>
+          <wp:inline distT="0" distB="0" distL="0" distR="0" wp14:anchorId="6901B963" wp14:editId="3DD5424E">
+            <wp:extent cx="5943600" cy="362585"/>
+            <wp:effectExtent l="0" t="0" r="0" b="0"/>
+            <wp:docPr id="413201552" name="Picture 1"/>
+            <wp:cNvGraphicFramePr>
+              <a:graphicFrameLocks xmlns:a="http://schemas.openxmlformats.org/drawingml/2006/main" noChangeAspect="1"/>
+            </wp:cNvGraphicFramePr>
+            <a:graphic xmlns:a="http://schemas.openxmlformats.org/drawingml/2006/main">
+              <a:graphicData uri="http://schemas.openxmlformats.org/drawingml/2006/picture">
+                <pic:pic xmlns:pic="http://schemas.openxmlformats.org/drawingml/2006/picture">
+                  <pic:nvPicPr>
+                    <pic:cNvPr id="413201552" name=""/>
+                    <pic:cNvPicPr/>
+                  </pic:nvPicPr>
+                  <pic:blipFill>
+                    <a:blip r:embed="rId29"/>
+                    <a:stretch>
+                      <a:fillRect/>
+                    </a:stretch>
+                  </pic:blipFill>
+                  <pic:spPr>
+                    <a:xfrm>
+                      <a:off x="0" y="0"/>
+                      <a:ext cx="5943600" cy="362585"/>
+                    </a:xfrm>
+                    <a:prstGeom prst="rect">
+                      <a:avLst/>
+                    </a:prstGeom>
+                  </pic:spPr>
+                </pic:pic>
+              </a:graphicData>
+            </a:graphic>
+          </wp:inline>
+        </w:drawing>
+      </w:r>
+    </w:p>
+    <w:p>
+      <w:pPr>
+        <w:pStyle w:val="ListParagraph"/>
+        <w:numPr>
+          <w:ilvl w:val="0"/>
+          <w:numId w:val="1"/>
+        </w:numPr>
+      </w:pPr>
+      <w:r>
+        <w:t xml:space="preserve"> </w:t>
+      </w:r>
+      <w:r>
+        <w:t>docker network connect my_network my_nginx</w:t>
+      </w:r>
+    </w:p>
+    <w:p>
+      <w:r>
+        <w:drawing>
+          <wp:inline distT="0" distB="0" distL="0" distR="0" wp14:anchorId="071CB191" wp14:editId="5FCE60CD">
+            <wp:extent cx="5943600" cy="462280"/>
+            <wp:effectExtent l="0" t="0" r="0" b="0"/>
+            <wp:docPr id="1029470165" name="Picture 1"/>
+            <wp:cNvGraphicFramePr>
+              <a:graphicFrameLocks xmlns:a="http://schemas.openxmlformats.org/drawingml/2006/main" noChangeAspect="1"/>
+            </wp:cNvGraphicFramePr>
+            <a:graphic xmlns:a="http://schemas.openxmlformats.org/drawingml/2006/main">
+              <a:graphicData uri="http://schemas.openxmlformats.org/drawingml/2006/picture">
+                <pic:pic xmlns:pic="http://schemas.openxmlformats.org/drawingml/2006/picture">
+                  <pic:nvPicPr>
+                    <pic:cNvPr id="1029470165" name=""/>
+                    <pic:cNvPicPr/>
+                  </pic:nvPicPr>
+                  <pic:blipFill>
+                    <a:blip r:embed="rId30"/>
+                    <a:stretch>
+                      <a:fillRect/>
+                    </a:stretch>
+                  </pic:blipFill>
+                  <pic:spPr>
+                    <a:xfrm>
+                      <a:off x="0" y="0"/>
+                      <a:ext cx="5943600" cy="462280"/>
+                    </a:xfrm>
+                    <a:prstGeom prst="rect">
+                      <a:avLst/>
+                    </a:prstGeom>
+                  </pic:spPr>
+                </pic:pic>
+              </a:graphicData>
+            </a:graphic>
+          </wp:inline>
+        </w:drawing>
+      </w:r>
+    </w:p>
+    <w:p>
+      <w:pPr>
+        <w:pStyle w:val="ListParagraph"/>
+        <w:numPr>
+          <w:ilvl w:val="0"/>
+          <w:numId w:val="1"/>
+        </w:numPr>
+      </w:pPr>
+      <w:r>
+        <w:t xml:space="preserve"> </w:t>
+      </w:r>
+      <w:r>
+        <w:t>docker run -d -e MY_ENV=hello_world nginx</w:t>
+      </w:r>
+    </w:p>
+    <w:p>
+      <w:r>
+        <w:drawing>
+          <wp:inline distT="0" distB="0" distL="0" distR="0" wp14:anchorId="044EEF53" wp14:editId="6D70B82D">
+            <wp:extent cx="5943600" cy="539115"/>
+            <wp:effectExtent l="0" t="0" r="0" b="0"/>
+            <wp:docPr id="586198630" name="Picture 1"/>
+            <wp:cNvGraphicFramePr>
+              <a:graphicFrameLocks xmlns:a="http://schemas.openxmlformats.org/drawingml/2006/main" noChangeAspect="1"/>
+            </wp:cNvGraphicFramePr>
+            <a:graphic xmlns:a="http://schemas.openxmlformats.org/drawingml/2006/main">
+              <a:graphicData uri="http://schemas.openxmlformats.org/drawingml/2006/picture">
+                <pic:pic xmlns:pic="http://schemas.openxmlformats.org/drawingml/2006/picture">
+                  <pic:nvPicPr>
+                    <pic:cNvPr id="586198630" name=""/>
+                    <pic:cNvPicPr/>
+                  </pic:nvPicPr>
+                  <pic:blipFill>
+                    <a:blip r:embed="rId31"/>
+                    <a:stretch>
+                      <a:fillRect/>
+                    </a:stretch>
+                  </pic:blipFill>
+                  <pic:spPr>
+                    <a:xfrm>
+                      <a:off x="0" y="0"/>
+                      <a:ext cx="5943600" cy="539115"/>
+                    </a:xfrm>
+                    <a:prstGeom prst="rect">
+                      <a:avLst/>
+                    </a:prstGeom>
+                  </pic:spPr>
+                </pic:pic>
+              </a:graphicData>
+            </a:graphic>
+          </wp:inline>
+        </w:drawing>
+      </w:r>
+    </w:p>
+    <w:p>
+      <w:pPr>
+        <w:pStyle w:val="ListParagraph"/>
+        <w:numPr>
+          <w:ilvl w:val="0"/>
+          <w:numId w:val="1"/>
+        </w:numPr>
+      </w:pPr>
+      <w:r>
+        <w:t xml:space="preserve"> </w:t>
+      </w:r>
+      <w:r>
+        <w:t>docker logs -f my_nginx</w:t>
+      </w:r>
+      <w:r>
+        <w:t xml:space="preserve"> </w:t>
+      </w:r>
+    </w:p>
+    <w:p>
+      <w:r>
+        <w:lastRenderedPageBreak/>
+        <w:drawing>
+          <wp:inline distT="0" distB="0" distL="0" distR="0" wp14:anchorId="70C41588" wp14:editId="2BEEC526">
+            <wp:extent cx="5943600" cy="3440430"/>
+            <wp:effectExtent l="0" t="0" r="0" b="7620"/>
+            <wp:docPr id="491276853" name="Picture 1"/>
+            <wp:cNvGraphicFramePr>
+              <a:graphicFrameLocks xmlns:a="http://schemas.openxmlformats.org/drawingml/2006/main" noChangeAspect="1"/>
+            </wp:cNvGraphicFramePr>
+            <a:graphic xmlns:a="http://schemas.openxmlformats.org/drawingml/2006/main">
+              <a:graphicData uri="http://schemas.openxmlformats.org/drawingml/2006/picture">
+                <pic:pic xmlns:pic="http://schemas.openxmlformats.org/drawingml/2006/picture">
+                  <pic:nvPicPr>
+                    <pic:cNvPr id="491276853" name=""/>
+                    <pic:cNvPicPr/>
+                  </pic:nvPicPr>
+                  <pic:blipFill>
+                    <a:blip r:embed="rId32"/>
+                    <a:stretch>
+                      <a:fillRect/>
+                    </a:stretch>
+                  </pic:blipFill>
+                  <pic:spPr>
+                    <a:xfrm>
+                      <a:off x="0" y="0"/>
+                      <a:ext cx="5943600" cy="3440430"/>
+                    </a:xfrm>
+                    <a:prstGeom prst="rect">
+                      <a:avLst/>
+                    </a:prstGeom>
+                  </pic:spPr>
+                </pic:pic>
+              </a:graphicData>
+            </a:graphic>
+          </wp:inline>
+        </w:drawing>
+      </w:r>
+    </w:p>
+    <w:p>
+      <w:pPr>
+        <w:pStyle w:val="ListParagraph"/>
+        <w:numPr>
+          <w:ilvl w:val="0"/>
+          <w:numId w:val="1"/>
+        </w:numPr>
+      </w:pPr>
+      <w:r>
+        <w:t>FROM nginx</w:t>
+      </w:r>
+    </w:p>
+    <w:p>
+      <w:pPr>
+        <w:pStyle w:val="ListParagraph"/>
+        <w:ind w:left="360"/>
+      </w:pPr>
+      <w:r>
+        <w:t>COPY index.html /usr/share/nginx/html/index.html</w:t>
+      </w:r>
+      <w:r>
+        <w:t xml:space="preserve"> </w:t>
+      </w:r>
+    </w:p>
+    <w:p>
+      <w:pPr>
+        <w:pStyle w:val="ListParagraph"/>
+        <w:ind w:left="360"/>
+      </w:pPr>
+      <w:r>
+        <w:drawing>
+          <wp:inline distT="0" distB="0" distL="0" distR="0" wp14:anchorId="0CD94BC6" wp14:editId="073CB4BD">
+            <wp:extent cx="5258534" cy="1190791"/>
+            <wp:effectExtent l="0" t="0" r="0" b="9525"/>
+            <wp:docPr id="1631427375" name="Picture 1"/>
+            <wp:cNvGraphicFramePr>
+              <a:graphicFrameLocks xmlns:a="http://schemas.openxmlformats.org/drawingml/2006/main" noChangeAspect="1"/>
+            </wp:cNvGraphicFramePr>
+            <a:graphic xmlns:a="http://schemas.openxmlformats.org/drawingml/2006/main">
+              <a:graphicData uri="http://schemas.openxmlformats.org/drawingml/2006/picture">
+                <pic:pic xmlns:pic="http://schemas.openxmlformats.org/drawingml/2006/picture">
+                  <pic:nvPicPr>
+                    <pic:cNvPr id="1631427375" name=""/>
+                    <pic:cNvPicPr/>
+                  </pic:nvPicPr>
+                  <pic:blipFill>
+                    <a:blip r:embed="rId33"/>
+                    <a:stretch>
+                      <a:fillRect/>
+                    </a:stretch>
+                  </pic:blipFill>
+                  <pic:spPr>
+                    <a:xfrm>
+                      <a:off x="0" y="0"/>
+                      <a:ext cx="5258534" cy="1190791"/>
+                    </a:xfrm>
+                    <a:prstGeom prst="rect">
+                      <a:avLst/>
+                    </a:prstGeom>
+                  </pic:spPr>
+                </pic:pic>
+              </a:graphicData>
+            </a:graphic>
+          </wp:inline>
+        </w:drawing>
+      </w:r>
+    </w:p>
+    <w:p>
+      <w:pPr>
+        <w:pStyle w:val="ListParagraph"/>
+        <w:numPr>
+          <w:ilvl w:val="0"/>
+          <w:numId w:val="1"/>
+        </w:numPr>
+      </w:pPr>
+      <w:r>
+        <w:t xml:space="preserve"> </w:t>
+      </w:r>
+      <w:r>
+        <w:t>docker build -t my_nginx_image .</w:t>
+      </w:r>
+    </w:p>
+    <w:p>
+      <w:r>
+        <w:lastRenderedPageBreak/>
+        <w:drawing>
+          <wp:inline distT="0" distB="0" distL="0" distR="0" wp14:anchorId="627EA23F" wp14:editId="27955BA3">
+            <wp:extent cx="5943600" cy="3617595"/>
+            <wp:effectExtent l="0" t="0" r="0" b="1905"/>
+            <wp:docPr id="812102035" name="Picture 1"/>
+            <wp:cNvGraphicFramePr>
+              <a:graphicFrameLocks xmlns:a="http://schemas.openxmlformats.org/drawingml/2006/main" noChangeAspect="1"/>
+            </wp:cNvGraphicFramePr>
+            <a:graphic xmlns:a="http://schemas.openxmlformats.org/drawingml/2006/main">
+              <a:graphicData uri="http://schemas.openxmlformats.org/drawingml/2006/picture">
+                <pic:pic xmlns:pic="http://schemas.openxmlformats.org/drawingml/2006/picture">
+                  <pic:nvPicPr>
+                    <pic:cNvPr id="812102035" name=""/>
+                    <pic:cNvPicPr/>
+                  </pic:nvPicPr>
+                  <pic:blipFill>
+                    <a:blip r:embed="rId34"/>
+                    <a:stretch>
+                      <a:fillRect/>
+                    </a:stretch>
+                  </pic:blipFill>
+                  <pic:spPr>
+                    <a:xfrm>
+                      <a:off x="0" y="0"/>
+                      <a:ext cx="5943600" cy="3617595"/>
+                    </a:xfrm>
+                    <a:prstGeom prst="rect">
+                      <a:avLst/>
+                    </a:prstGeom>
+                  </pic:spPr>
+                </pic:pic>
+              </a:graphicData>
+            </a:graphic>
+          </wp:inline>
+        </w:drawing>
+      </w:r>
+    </w:p>
+    <w:p>
+      <w:pPr>
+        <w:pStyle w:val="ListParagraph"/>
+        <w:numPr>
+          <w:ilvl w:val="0"/>
+          <w:numId w:val="1"/>
+        </w:numPr>
+      </w:pPr>
+      <w:r>
+        <w:t xml:space="preserve"> </w:t>
+      </w:r>
+      <w:r>
+        <w:t>docker run -d -p 8080:80 my_nginx_image</w:t>
+      </w:r>
+      <w:r>
+        <w:t>.</w:t>
+      </w:r>
+    </w:p>
+    <w:p>
+      <w:r>
+        <w:drawing>
+          <wp:inline distT="0" distB="0" distL="0" distR="0" wp14:anchorId="2E554AF1" wp14:editId="4FF429FB">
+            <wp:extent cx="5943600" cy="475615"/>
+            <wp:effectExtent l="0" t="0" r="0" b="635"/>
+            <wp:docPr id="150894541" name="Picture 1"/>
+            <wp:cNvGraphicFramePr>
+              <a:graphicFrameLocks xmlns:a="http://schemas.openxmlformats.org/drawingml/2006/main" noChangeAspect="1"/>
+            </wp:cNvGraphicFramePr>
+            <a:graphic xmlns:a="http://schemas.openxmlformats.org/drawingml/2006/main">
+              <a:graphicData uri="http://schemas.openxmlformats.org/drawingml/2006/picture">
+                <pic:pic xmlns:pic="http://schemas.openxmlformats.org/drawingml/2006/picture">
+                  <pic:nvPicPr>
+                    <pic:cNvPr id="150894541" name=""/>
+                    <pic:cNvPicPr/>
+                  </pic:nvPicPr>
+                  <pic:blipFill>
+                    <a:blip r:embed="rId35"/>
+                    <a:stretch>
+                      <a:fillRect/>
+                    </a:stretch>
+                  </pic:blipFill>
+                  <pic:spPr>
+                    <a:xfrm>
+                      <a:off x="0" y="0"/>
+                      <a:ext cx="5943600" cy="475615"/>
+                    </a:xfrm>
+                    <a:prstGeom prst="rect">
+                      <a:avLst/>
+                    </a:prstGeom>
+                  </pic:spPr>
+                </pic:pic>
+              </a:graphicData>
+            </a:graphic>
+          </wp:inline>
+        </w:drawing>
+      </w:r>
+    </w:p>
+    <w:p>
+      <w:r>
+        <w:drawing>
+          <wp:inline distT="0" distB="0" distL="0" distR="0" wp14:anchorId="5445C07B" wp14:editId="5D6EF242">
+            <wp:extent cx="5943600" cy="1989455"/>
+            <wp:effectExtent l="0" t="0" r="0" b="0"/>
+            <wp:docPr id="1229986946" name="Picture 1"/>
+            <wp:cNvGraphicFramePr>
+              <a:graphicFrameLocks xmlns:a="http://schemas.openxmlformats.org/drawingml/2006/main" noChangeAspect="1"/>
+            </wp:cNvGraphicFramePr>
+            <a:graphic xmlns:a="http://schemas.openxmlformats.org/drawingml/2006/main">
+              <a:graphicData uri="http://schemas.openxmlformats.org/drawingml/2006/picture">
+                <pic:pic xmlns:pic="http://schemas.openxmlformats.org/drawingml/2006/picture">
+                  <pic:nvPicPr>
+                    <pic:cNvPr id="1229986946" name=""/>
+                    <pic:cNvPicPr/>
+                  </pic:nvPicPr>
+                  <pic:blipFill>
+                    <a:blip r:embed="rId36"/>
+                    <a:stretch>
+                      <a:fillRect/>
+                    </a:stretch>
+                  </pic:blipFill>
+                  <pic:spPr>
+                    <a:xfrm>
+                      <a:off x="0" y="0"/>
+                      <a:ext cx="5943600" cy="1989455"/>
+                    </a:xfrm>
+                    <a:prstGeom prst="rect">
+                      <a:avLst/>
+                    </a:prstGeom>
+                  </pic:spPr>
+                </pic:pic>
+              </a:graphicData>
+            </a:graphic>
+          </wp:inline>
+        </w:drawing>
+      </w:r>
     </w:p>
     <w:sectPr>
       <w:pgSz w:w="12240" w:h="15840"/>
@@ -87,8 +1732,8 @@
 </file>
 
 <file path=word/numbering.xml><?xml version="1.0" encoding="utf-8"?>
-<w:numbering xmlns:wpc="http://schemas.microsoft.com/office/word/2010/wordprocessingCanvas" xmlns:mc="http://schemas.openxmlformats.org/markup-compatibility/2006" xmlns:o="urn:schemas-microsoft-com:office:office" xmlns:r="http://schemas.openxmlformats.org/officeDocument/2006/relationships" xmlns:m="http://schemas.openxmlformats.org/officeDocument/2006/math" xmlns:v="urn:schemas-microsoft-com:vml" xmlns:wp14="http://schemas.microsoft.com/office/word/2010/wordprocessingDrawing" xmlns:wp="http://schemas.openxmlformats.org/drawingml/2006/wordprocessingDrawing" xmlns:w10="urn:schemas-microsoft-com:office:word" xmlns:w="http://schemas.openxmlformats.org/wordprocessingml/2006/main" xmlns:w14="http://schemas.microsoft.com/office/word/2010/wordml" xmlns:w15="http://schemas.microsoft.com/office/word/2012/wordml" xmlns:wpg="http://schemas.microsoft.com/office/word/2010/wordprocessingGroup" xmlns:wpi="http://schemas.microsoft.com/office/word/2010/wordprocessingInk" xmlns:wne="http://schemas.microsoft.com/office/word/2006/wordml" xmlns:wps="http://schemas.microsoft.com/office/word/2010/wordprocessingShape" mc:Ignorable="w14 w15 wp14">
-  <w:abstractNum w:abstractNumId="0">
+<w:numbering xmlns:wpc="http://schemas.microsoft.com/office/word/2010/wordprocessingCanvas" xmlns:cx="http://schemas.microsoft.com/office/drawing/2014/chartex" xmlns:cx1="http://schemas.microsoft.com/office/drawing/2015/9/8/chartex" xmlns:cx2="http://schemas.microsoft.com/office/drawing/2015/10/21/chartex" xmlns:cx3="http://schemas.microsoft.com/office/drawing/2016/5/9/chartex" xmlns:cx4="http://schemas.microsoft.com/office/drawing/2016/5/10/chartex" xmlns:cx5="http://schemas.microsoft.com/office/drawing/2016/5/11/chartex" xmlns:cx6="http://schemas.microsoft.com/office/drawing/2016/5/12/chartex" xmlns:cx7="http://schemas.microsoft.com/office/drawing/2016/5/13/chartex" xmlns:cx8="http://schemas.microsoft.com/office/drawing/2016/5/14/chartex" xmlns:mc="http://schemas.openxmlformats.org/markup-compatibility/2006" xmlns:aink="http://schemas.microsoft.com/office/drawing/2016/ink" xmlns:am3d="http://schemas.microsoft.com/office/drawing/2017/model3d" xmlns:o="urn:schemas-microsoft-com:office:office" xmlns:oel="http://schemas.microsoft.com/office/2019/extlst" xmlns:r="http://schemas.openxmlformats.org/officeDocument/2006/relationships" xmlns:m="http://schemas.openxmlformats.org/officeDocument/2006/math" xmlns:v="urn:schemas-microsoft-com:vml" xmlns:wp14="http://schemas.microsoft.com/office/word/2010/wordprocessingDrawing" xmlns:wp="http://schemas.openxmlformats.org/drawingml/2006/wordprocessingDrawing" xmlns:w10="urn:schemas-microsoft-com:office:word" xmlns:w="http://schemas.openxmlformats.org/wordprocessingml/2006/main" xmlns:w14="http://schemas.microsoft.com/office/word/2010/wordml" xmlns:w15="http://schemas.microsoft.com/office/word/2012/wordml" xmlns:w16cex="http://schemas.microsoft.com/office/word/2018/wordml/cex" xmlns:w16cid="http://schemas.microsoft.com/office/word/2016/wordml/cid" xmlns:w16="http://schemas.microsoft.com/office/word/2018/wordml" xmlns:w16du="http://schemas.microsoft.com/office/word/2023/wordml/word16du" xmlns:w16sdtdh="http://schemas.microsoft.com/office/word/2020/wordml/sdtdatahash" xmlns:w16sdtfl="http://schemas.microsoft.com/office/word/2024/wordml/sdtformatlock" xmlns:w16se="http://schemas.microsoft.com/office/word/2015/wordml/symex" xmlns:wpg="http://schemas.microsoft.com/office/word/2010/wordprocessingGroup" xmlns:wpi="http://schemas.microsoft.com/office/word/2010/wordprocessingInk" xmlns:wne="http://schemas.microsoft.com/office/word/2006/wordml" xmlns:wps="http://schemas.microsoft.com/office/word/2010/wordprocessingShape" mc:Ignorable="w14 w15 w16se w16cid w16 w16cex w16sdtdh w16sdtfl w16du wp14">
+  <w:abstractNum w:abstractNumId="0" w15:restartNumberingAfterBreak="0">
     <w:nsid w:val="041E1950"/>
     <w:multiLevelType w:val="hybridMultilevel"/>
     <w:tmpl w:val="CCBCBC04"/>
@@ -177,14 +1822,14 @@
       </w:pPr>
     </w:lvl>
   </w:abstractNum>
-  <w:num w:numId="1">
+  <w:num w:numId="1" w16cid:durableId="209194563">
     <w:abstractNumId w:val="0"/>
   </w:num>
 </w:numbering>
 </file>
 
 <file path=word/styles.xml><?xml version="1.0" encoding="utf-8"?>
-<w:styles xmlns:mc="http://schemas.openxmlformats.org/markup-compatibility/2006" xmlns:r="http://schemas.openxmlformats.org/officeDocument/2006/relationships" xmlns:w="http://schemas.openxmlformats.org/wordprocessingml/2006/main" xmlns:w14="http://schemas.microsoft.com/office/word/2010/wordml" xmlns:w15="http://schemas.microsoft.com/office/word/2012/wordml" mc:Ignorable="w14 w15">
+<w:styles xmlns:mc="http://schemas.openxmlformats.org/markup-compatibility/2006" xmlns:r="http://schemas.openxmlformats.org/officeDocument/2006/relationships" xmlns:w="http://schemas.openxmlformats.org/wordprocessingml/2006/main" xmlns:w14="http://schemas.microsoft.com/office/word/2010/wordml" xmlns:w15="http://schemas.microsoft.com/office/word/2012/wordml" xmlns:w16cex="http://schemas.microsoft.com/office/word/2018/wordml/cex" xmlns:w16cid="http://schemas.microsoft.com/office/word/2016/wordml/cid" xmlns:w16="http://schemas.microsoft.com/office/word/2018/wordml" xmlns:w16du="http://schemas.microsoft.com/office/word/2023/wordml/word16du" xmlns:w16sdtdh="http://schemas.microsoft.com/office/word/2020/wordml/sdtdatahash" xmlns:w16sdtfl="http://schemas.microsoft.com/office/word/2024/wordml/sdtformatlock" xmlns:w16se="http://schemas.microsoft.com/office/word/2015/wordml/symex" mc:Ignorable="w14 w15 w16se w16cid w16 w16cex w16sdtdh w16sdtfl w16du">
   <w:docDefaults>
     <w:rPrDefault>
       <w:rPr>
@@ -200,7 +1845,7 @@
       </w:pPr>
     </w:pPrDefault>
   </w:docDefaults>
-  <w:latentStyles w:defLockedState="0" w:defUIPriority="99" w:defSemiHidden="0" w:defUnhideWhenUsed="0" w:defQFormat="0" w:count="371">
+  <w:latentStyles w:defLockedState="0" w:defUIPriority="99" w:defSemiHidden="0" w:defUnhideWhenUsed="0" w:defQFormat="0" w:count="376">
     <w:lsdException w:name="Normal" w:uiPriority="0" w:qFormat="1"/>
     <w:lsdException w:name="heading 1" w:uiPriority="9" w:qFormat="1"/>
     <w:lsdException w:name="heading 2" w:semiHidden="1" w:uiPriority="9" w:unhideWhenUsed="1" w:qFormat="1"/>
@@ -572,15 +2217,27 @@
     <w:lsdException w:name="List Table 5 Dark Accent 6" w:uiPriority="50"/>
     <w:lsdException w:name="List Table 6 Colorful Accent 6" w:uiPriority="51"/>
     <w:lsdException w:name="List Table 7 Colorful Accent 6" w:uiPriority="52"/>
+    <w:lsdException w:name="Mention" w:semiHidden="1" w:unhideWhenUsed="1"/>
+    <w:lsdException w:name="Smart Hyperlink" w:semiHidden="1" w:unhideWhenUsed="1"/>
+    <w:lsdException w:name="Hashtag" w:semiHidden="1" w:unhideWhenUsed="1"/>
+    <w:lsdException w:name="Unresolved Mention" w:semiHidden="1" w:unhideWhenUsed="1"/>
+    <w:lsdException w:name="Smart Link" w:semiHidden="1" w:unhideWhenUsed="1"/>
   </w:latentStyles>
   <w:style w:type="paragraph" w:default="1" w:styleId="Normal">
     <w:name w:val="Normal"/>
     <w:qFormat/>
+    <w:rsid w:val="00097486"/>
+    <w:pPr>
+      <w:spacing w:line="360" w:lineRule="auto"/>
+    </w:pPr>
+    <w:rPr>
+      <w:rFonts w:ascii="Times New Roman" w:hAnsi="Times New Roman"/>
+      <w:sz w:val="26"/>
+    </w:rPr>
   </w:style>
   <w:style w:type="character" w:default="1" w:styleId="DefaultParagraphFont">
     <w:name w:val="Default Paragraph Font"/>
     <w:uiPriority w:val="1"/>
-    <w:semiHidden/>
     <w:unhideWhenUsed/>
   </w:style>
   <w:style w:type="table" w:default="1" w:styleId="TableNormal">

</xml_diff>